<commit_message>
Ch 0.0 — Series Introduction: Response from the Parliament of LLMs
</commit_message>
<xml_diff>
--- a/outputs/your_book.docx
+++ b/outputs/your_book.docx
@@ -4778,15 +4778,6 @@
           <w:iCs/>
         </w:rPr>
         <w:t xml:space="preserve">The anchor holds.</w:t>
-      </w:r>
-      <w:r>
-        <w:t xml:space="preserve"> </w:t>
-      </w:r>
-      <w:r>
-        <w:t xml:space="preserve">’@ | Set-Content -Path “publication</w:t>
-      </w:r>
-      <w:r>
-        <w:t xml:space="preserve">_book.md” -Encoding UTF8</w:t>
       </w:r>
     </w:p>
     <w:bookmarkEnd w:id="91"/>

</xml_diff>